<commit_message>
Record static UI review publication evidence
</commit_message>
<xml_diff>
--- a/docs/reports/2026-10-28-static-ui-release-verification.docx
+++ b/docs/reports/2026-10-28-static-ui-release-verification.docx
@@ -195,6 +195,19 @@
     <w:p>
       <w:r>
         <w:t>Next: authenticate normally, verify the candidate's public pages/assets/scripts and private/API denials, publish reviewed source to main after required checks, promote the verified build, read back the stable alias and repeat functional checks. Preserve a compatible static rollback reference and record actual rollback evidence separately.</w:t>
+      </w:r>
+    </w:p>
+    <w:p>
+      <w:pPr>
+        <w:pStyle w:val="Heading1"/>
+      </w:pPr>
+      <w:r>
+        <w:t>Git publication evidence</w:t>
+      </w:r>
+    </w:p>
+    <w:p>
+      <w:r>
+        <w:t>The non-force review push exits 0. Independent remote-head readback confirms 1842c1ba9b80bfc2c721d7102d34b3f67d69439f on feature/phase1-staging-readiness and f6bd316b2fe4e3fed1411bd057d0c486afac2e28 on release/main-20261026. Main remains 284bcdb75c4da7705d4f1c9890960436b94c422a. The release report commit preserves all tested application bytes from d881cad; the cherry-pick conflict in the open questions document is resolved by retaining both the existing scoped approval and the current verification blocker. Subsequent report-only commits carry this publication evidence. Review pushes can trigger Git automation; no new successful Preview, public promotion or human acceptance is inferred.</w:t>
       </w:r>
     </w:p>
     <w:sectPr>

</xml_diff>